<commit_message>
Napisano poročilo do puzzle rooma
</commit_message>
<xml_diff>
--- a/PorociloMatura.docx
+++ b/PorociloMatura.docx
@@ -350,22 +350,1767 @@
         <w:t>Ljubljana, April 2025</w:t>
       </w:r>
     </w:p>
+    <w:sdt>
+      <w:sdtPr>
+        <w:id w:val="1917896316"/>
+        <w:docPartObj>
+          <w:docPartGallery w:val="Table of Contents"/>
+          <w:docPartUnique/>
+        </w:docPartObj>
+      </w:sdtPr>
+      <w:sdtEndPr>
+        <w:rPr>
+          <w:rFonts w:ascii="Arial" w:eastAsiaTheme="minorHAnsi" w:hAnsi="Arial" w:cs="Arial"/>
+          <w:b/>
+          <w:bCs/>
+          <w:color w:val="auto"/>
+          <w:sz w:val="24"/>
+          <w:szCs w:val="24"/>
+        </w:rPr>
+      </w:sdtEndPr>
+      <w:sdtContent>
+        <w:p>
+          <w:pPr>
+            <w:pStyle w:val="Naslov1"/>
+          </w:pPr>
+          <w:r>
+            <w:t xml:space="preserve">Kazalo </w:t>
+          </w:r>
+          <w:r>
+            <w:t>Vsebin</w:t>
+          </w:r>
+          <w:r>
+            <w:t>e</w:t>
+          </w:r>
+        </w:p>
+        <w:p>
+          <w:pPr>
+            <w:pStyle w:val="Kazalovsebine1"/>
+            <w:tabs>
+              <w:tab w:val="right" w:leader="dot" w:pos="9016"/>
+            </w:tabs>
+            <w:rPr>
+              <w:rFonts w:asciiTheme="minorHAnsi" w:eastAsiaTheme="minorEastAsia" w:hAnsiTheme="minorHAnsi" w:cstheme="minorBidi"/>
+              <w:noProof/>
+              <w:lang w:eastAsia="sl-SI"/>
+            </w:rPr>
+          </w:pPr>
+          <w:r>
+            <w:fldChar w:fldCharType="begin"/>
+          </w:r>
+          <w:r>
+            <w:instrText xml:space="preserve"> TOC \o "1-3" \h \z \u </w:instrText>
+          </w:r>
+          <w:r>
+            <w:fldChar w:fldCharType="separate"/>
+          </w:r>
+          <w:hyperlink w:anchor="_Toc195559128" w:history="1">
+            <w:r>
+              <w:rPr>
+                <w:rStyle w:val="Hiperpovezava"/>
+                <w:noProof/>
+              </w:rPr>
+              <w:t>Kazalo</w:t>
+            </w:r>
+            <w:r>
+              <w:rPr>
+                <w:noProof/>
+                <w:webHidden/>
+              </w:rPr>
+              <w:tab/>
+            </w:r>
+            <w:r>
+              <w:rPr>
+                <w:noProof/>
+                <w:webHidden/>
+              </w:rPr>
+              <w:fldChar w:fldCharType="begin"/>
+            </w:r>
+            <w:r>
+              <w:rPr>
+                <w:noProof/>
+                <w:webHidden/>
+              </w:rPr>
+              <w:instrText xml:space="preserve"> PAGEREF _Toc195559128 \h </w:instrText>
+            </w:r>
+            <w:r>
+              <w:rPr>
+                <w:noProof/>
+                <w:webHidden/>
+              </w:rPr>
+            </w:r>
+            <w:r>
+              <w:rPr>
+                <w:noProof/>
+                <w:webHidden/>
+              </w:rPr>
+              <w:fldChar w:fldCharType="separate"/>
+            </w:r>
+            <w:r>
+              <w:rPr>
+                <w:noProof/>
+                <w:webHidden/>
+              </w:rPr>
+              <w:t>2</w:t>
+            </w:r>
+            <w:r>
+              <w:rPr>
+                <w:noProof/>
+                <w:webHidden/>
+              </w:rPr>
+              <w:fldChar w:fldCharType="end"/>
+            </w:r>
+          </w:hyperlink>
+        </w:p>
+        <w:p>
+          <w:pPr>
+            <w:pStyle w:val="Kazalovsebine1"/>
+            <w:tabs>
+              <w:tab w:val="left" w:pos="480"/>
+              <w:tab w:val="right" w:leader="dot" w:pos="9016"/>
+            </w:tabs>
+            <w:rPr>
+              <w:rFonts w:asciiTheme="minorHAnsi" w:eastAsiaTheme="minorEastAsia" w:hAnsiTheme="minorHAnsi" w:cstheme="minorBidi"/>
+              <w:noProof/>
+              <w:lang w:eastAsia="sl-SI"/>
+            </w:rPr>
+          </w:pPr>
+          <w:hyperlink w:anchor="_Toc195559129" w:history="1">
+            <w:r>
+              <w:rPr>
+                <w:rStyle w:val="Hiperpovezava"/>
+                <w:noProof/>
+              </w:rPr>
+              <w:t>1.</w:t>
+            </w:r>
+            <w:r>
+              <w:rPr>
+                <w:rFonts w:asciiTheme="minorHAnsi" w:eastAsiaTheme="minorEastAsia" w:hAnsiTheme="minorHAnsi" w:cstheme="minorBidi"/>
+                <w:noProof/>
+                <w:lang w:eastAsia="sl-SI"/>
+              </w:rPr>
+              <w:tab/>
+            </w:r>
+            <w:r>
+              <w:rPr>
+                <w:rStyle w:val="Hiperpovezava"/>
+                <w:noProof/>
+              </w:rPr>
+              <w:t>Povzetek</w:t>
+            </w:r>
+            <w:r>
+              <w:rPr>
+                <w:noProof/>
+                <w:webHidden/>
+              </w:rPr>
+              <w:tab/>
+            </w:r>
+            <w:r>
+              <w:rPr>
+                <w:noProof/>
+                <w:webHidden/>
+              </w:rPr>
+              <w:fldChar w:fldCharType="begin"/>
+            </w:r>
+            <w:r>
+              <w:rPr>
+                <w:noProof/>
+                <w:webHidden/>
+              </w:rPr>
+              <w:instrText xml:space="preserve"> PAGEREF _Toc195559129 \h </w:instrText>
+            </w:r>
+            <w:r>
+              <w:rPr>
+                <w:noProof/>
+                <w:webHidden/>
+              </w:rPr>
+            </w:r>
+            <w:r>
+              <w:rPr>
+                <w:noProof/>
+                <w:webHidden/>
+              </w:rPr>
+              <w:fldChar w:fldCharType="separate"/>
+            </w:r>
+            <w:r>
+              <w:rPr>
+                <w:noProof/>
+                <w:webHidden/>
+              </w:rPr>
+              <w:t>3</w:t>
+            </w:r>
+            <w:r>
+              <w:rPr>
+                <w:noProof/>
+                <w:webHidden/>
+              </w:rPr>
+              <w:fldChar w:fldCharType="end"/>
+            </w:r>
+          </w:hyperlink>
+        </w:p>
+        <w:p>
+          <w:pPr>
+            <w:pStyle w:val="Kazalovsebine1"/>
+            <w:tabs>
+              <w:tab w:val="left" w:pos="480"/>
+              <w:tab w:val="right" w:leader="dot" w:pos="9016"/>
+            </w:tabs>
+            <w:rPr>
+              <w:rFonts w:asciiTheme="minorHAnsi" w:eastAsiaTheme="minorEastAsia" w:hAnsiTheme="minorHAnsi" w:cstheme="minorBidi"/>
+              <w:noProof/>
+              <w:lang w:eastAsia="sl-SI"/>
+            </w:rPr>
+          </w:pPr>
+          <w:hyperlink w:anchor="_Toc195559130" w:history="1">
+            <w:r>
+              <w:rPr>
+                <w:rStyle w:val="Hiperpovezava"/>
+                <w:noProof/>
+              </w:rPr>
+              <w:t>2.</w:t>
+            </w:r>
+            <w:r>
+              <w:rPr>
+                <w:rFonts w:asciiTheme="minorHAnsi" w:eastAsiaTheme="minorEastAsia" w:hAnsiTheme="minorHAnsi" w:cstheme="minorBidi"/>
+                <w:noProof/>
+                <w:lang w:eastAsia="sl-SI"/>
+              </w:rPr>
+              <w:tab/>
+            </w:r>
+            <w:r>
+              <w:rPr>
+                <w:rStyle w:val="Hiperpovezava"/>
+                <w:noProof/>
+              </w:rPr>
+              <w:t>Uvod</w:t>
+            </w:r>
+            <w:r>
+              <w:rPr>
+                <w:noProof/>
+                <w:webHidden/>
+              </w:rPr>
+              <w:tab/>
+            </w:r>
+            <w:r>
+              <w:rPr>
+                <w:noProof/>
+                <w:webHidden/>
+              </w:rPr>
+              <w:fldChar w:fldCharType="begin"/>
+            </w:r>
+            <w:r>
+              <w:rPr>
+                <w:noProof/>
+                <w:webHidden/>
+              </w:rPr>
+              <w:instrText xml:space="preserve"> PAGEREF _Toc195559130 \h </w:instrText>
+            </w:r>
+            <w:r>
+              <w:rPr>
+                <w:noProof/>
+                <w:webHidden/>
+              </w:rPr>
+            </w:r>
+            <w:r>
+              <w:rPr>
+                <w:noProof/>
+                <w:webHidden/>
+              </w:rPr>
+              <w:fldChar w:fldCharType="separate"/>
+            </w:r>
+            <w:r>
+              <w:rPr>
+                <w:noProof/>
+                <w:webHidden/>
+              </w:rPr>
+              <w:t>4</w:t>
+            </w:r>
+            <w:r>
+              <w:rPr>
+                <w:noProof/>
+                <w:webHidden/>
+              </w:rPr>
+              <w:fldChar w:fldCharType="end"/>
+            </w:r>
+          </w:hyperlink>
+        </w:p>
+        <w:p>
+          <w:pPr>
+            <w:pStyle w:val="Kazalovsebine1"/>
+            <w:tabs>
+              <w:tab w:val="left" w:pos="480"/>
+              <w:tab w:val="right" w:leader="dot" w:pos="9016"/>
+            </w:tabs>
+            <w:rPr>
+              <w:rFonts w:asciiTheme="minorHAnsi" w:eastAsiaTheme="minorEastAsia" w:hAnsiTheme="minorHAnsi" w:cstheme="minorBidi"/>
+              <w:noProof/>
+              <w:lang w:eastAsia="sl-SI"/>
+            </w:rPr>
+          </w:pPr>
+          <w:hyperlink w:anchor="_Toc195559131" w:history="1">
+            <w:r>
+              <w:rPr>
+                <w:rStyle w:val="Hiperpovezava"/>
+                <w:noProof/>
+              </w:rPr>
+              <w:t>3.</w:t>
+            </w:r>
+            <w:r>
+              <w:rPr>
+                <w:rFonts w:asciiTheme="minorHAnsi" w:eastAsiaTheme="minorEastAsia" w:hAnsiTheme="minorHAnsi" w:cstheme="minorBidi"/>
+                <w:noProof/>
+                <w:lang w:eastAsia="sl-SI"/>
+              </w:rPr>
+              <w:tab/>
+            </w:r>
+            <w:r>
+              <w:rPr>
+                <w:rStyle w:val="Hiperpovezava"/>
+                <w:noProof/>
+              </w:rPr>
+              <w:t>Opis projekta</w:t>
+            </w:r>
+            <w:r>
+              <w:rPr>
+                <w:noProof/>
+                <w:webHidden/>
+              </w:rPr>
+              <w:tab/>
+            </w:r>
+            <w:r>
+              <w:rPr>
+                <w:noProof/>
+                <w:webHidden/>
+              </w:rPr>
+              <w:fldChar w:fldCharType="begin"/>
+            </w:r>
+            <w:r>
+              <w:rPr>
+                <w:noProof/>
+                <w:webHidden/>
+              </w:rPr>
+              <w:instrText xml:space="preserve"> PAGEREF _Toc195559131 \h </w:instrText>
+            </w:r>
+            <w:r>
+              <w:rPr>
+                <w:noProof/>
+                <w:webHidden/>
+              </w:rPr>
+            </w:r>
+            <w:r>
+              <w:rPr>
+                <w:noProof/>
+                <w:webHidden/>
+              </w:rPr>
+              <w:fldChar w:fldCharType="separate"/>
+            </w:r>
+            <w:r>
+              <w:rPr>
+                <w:noProof/>
+                <w:webHidden/>
+              </w:rPr>
+              <w:t>5</w:t>
+            </w:r>
+            <w:r>
+              <w:rPr>
+                <w:noProof/>
+                <w:webHidden/>
+              </w:rPr>
+              <w:fldChar w:fldCharType="end"/>
+            </w:r>
+          </w:hyperlink>
+        </w:p>
+        <w:p>
+          <w:pPr>
+            <w:pStyle w:val="Kazalovsebine2"/>
+            <w:tabs>
+              <w:tab w:val="left" w:pos="960"/>
+              <w:tab w:val="right" w:leader="dot" w:pos="9016"/>
+            </w:tabs>
+            <w:rPr>
+              <w:rFonts w:asciiTheme="minorHAnsi" w:eastAsiaTheme="minorEastAsia" w:hAnsiTheme="minorHAnsi" w:cstheme="minorBidi"/>
+              <w:noProof/>
+              <w:lang w:eastAsia="sl-SI"/>
+            </w:rPr>
+          </w:pPr>
+          <w:hyperlink w:anchor="_Toc195559132" w:history="1">
+            <w:r>
+              <w:rPr>
+                <w:rStyle w:val="Hiperpovezava"/>
+                <w:noProof/>
+              </w:rPr>
+              <w:t>3.1</w:t>
+            </w:r>
+            <w:r>
+              <w:rPr>
+                <w:rFonts w:asciiTheme="minorHAnsi" w:eastAsiaTheme="minorEastAsia" w:hAnsiTheme="minorHAnsi" w:cstheme="minorBidi"/>
+                <w:noProof/>
+                <w:lang w:eastAsia="sl-SI"/>
+              </w:rPr>
+              <w:tab/>
+            </w:r>
+            <w:r>
+              <w:rPr>
+                <w:rStyle w:val="Hiperpovezava"/>
+                <w:noProof/>
+              </w:rPr>
+              <w:t>Ključne mehanike</w:t>
+            </w:r>
+            <w:r>
+              <w:rPr>
+                <w:noProof/>
+                <w:webHidden/>
+              </w:rPr>
+              <w:tab/>
+            </w:r>
+            <w:r>
+              <w:rPr>
+                <w:noProof/>
+                <w:webHidden/>
+              </w:rPr>
+              <w:fldChar w:fldCharType="begin"/>
+            </w:r>
+            <w:r>
+              <w:rPr>
+                <w:noProof/>
+                <w:webHidden/>
+              </w:rPr>
+              <w:instrText xml:space="preserve"> PAGEREF _Toc195559132 \h </w:instrText>
+            </w:r>
+            <w:r>
+              <w:rPr>
+                <w:noProof/>
+                <w:webHidden/>
+              </w:rPr>
+            </w:r>
+            <w:r>
+              <w:rPr>
+                <w:noProof/>
+                <w:webHidden/>
+              </w:rPr>
+              <w:fldChar w:fldCharType="separate"/>
+            </w:r>
+            <w:r>
+              <w:rPr>
+                <w:noProof/>
+                <w:webHidden/>
+              </w:rPr>
+              <w:t>5</w:t>
+            </w:r>
+            <w:r>
+              <w:rPr>
+                <w:noProof/>
+                <w:webHidden/>
+              </w:rPr>
+              <w:fldChar w:fldCharType="end"/>
+            </w:r>
+          </w:hyperlink>
+        </w:p>
+        <w:p>
+          <w:pPr>
+            <w:pStyle w:val="Kazalovsebine3"/>
+            <w:tabs>
+              <w:tab w:val="left" w:pos="1440"/>
+              <w:tab w:val="right" w:leader="dot" w:pos="9016"/>
+            </w:tabs>
+            <w:rPr>
+              <w:rFonts w:asciiTheme="minorHAnsi" w:eastAsiaTheme="minorEastAsia" w:hAnsiTheme="minorHAnsi" w:cstheme="minorBidi"/>
+              <w:noProof/>
+              <w:lang w:eastAsia="sl-SI"/>
+            </w:rPr>
+          </w:pPr>
+          <w:hyperlink w:anchor="_Toc195559133" w:history="1">
+            <w:r>
+              <w:rPr>
+                <w:rStyle w:val="Hiperpovezava"/>
+                <w:noProof/>
+              </w:rPr>
+              <w:t>3.1.1</w:t>
+            </w:r>
+            <w:r>
+              <w:rPr>
+                <w:rFonts w:asciiTheme="minorHAnsi" w:eastAsiaTheme="minorEastAsia" w:hAnsiTheme="minorHAnsi" w:cstheme="minorBidi"/>
+                <w:noProof/>
+                <w:lang w:eastAsia="sl-SI"/>
+              </w:rPr>
+              <w:tab/>
+            </w:r>
+            <w:r>
+              <w:rPr>
+                <w:rStyle w:val="Hiperpovezava"/>
+                <w:noProof/>
+              </w:rPr>
+              <w:t>Mehanike igralca</w:t>
+            </w:r>
+            <w:r>
+              <w:rPr>
+                <w:noProof/>
+                <w:webHidden/>
+              </w:rPr>
+              <w:tab/>
+            </w:r>
+            <w:r>
+              <w:rPr>
+                <w:noProof/>
+                <w:webHidden/>
+              </w:rPr>
+              <w:fldChar w:fldCharType="begin"/>
+            </w:r>
+            <w:r>
+              <w:rPr>
+                <w:noProof/>
+                <w:webHidden/>
+              </w:rPr>
+              <w:instrText xml:space="preserve"> PAGEREF _Toc195559133 \h </w:instrText>
+            </w:r>
+            <w:r>
+              <w:rPr>
+                <w:noProof/>
+                <w:webHidden/>
+              </w:rPr>
+            </w:r>
+            <w:r>
+              <w:rPr>
+                <w:noProof/>
+                <w:webHidden/>
+              </w:rPr>
+              <w:fldChar w:fldCharType="separate"/>
+            </w:r>
+            <w:r>
+              <w:rPr>
+                <w:noProof/>
+                <w:webHidden/>
+              </w:rPr>
+              <w:t>5</w:t>
+            </w:r>
+            <w:r>
+              <w:rPr>
+                <w:noProof/>
+                <w:webHidden/>
+              </w:rPr>
+              <w:fldChar w:fldCharType="end"/>
+            </w:r>
+          </w:hyperlink>
+        </w:p>
+        <w:p>
+          <w:pPr>
+            <w:pStyle w:val="Kazalovsebine3"/>
+            <w:tabs>
+              <w:tab w:val="left" w:pos="1440"/>
+              <w:tab w:val="right" w:leader="dot" w:pos="9016"/>
+            </w:tabs>
+            <w:rPr>
+              <w:rFonts w:asciiTheme="minorHAnsi" w:eastAsiaTheme="minorEastAsia" w:hAnsiTheme="minorHAnsi" w:cstheme="minorBidi"/>
+              <w:noProof/>
+              <w:lang w:eastAsia="sl-SI"/>
+            </w:rPr>
+          </w:pPr>
+          <w:hyperlink w:anchor="_Toc195559134" w:history="1">
+            <w:r>
+              <w:rPr>
+                <w:rStyle w:val="Hiperpovezava"/>
+                <w:noProof/>
+              </w:rPr>
+              <w:t>3.1.2</w:t>
+            </w:r>
+            <w:r>
+              <w:rPr>
+                <w:rFonts w:asciiTheme="minorHAnsi" w:eastAsiaTheme="minorEastAsia" w:hAnsiTheme="minorHAnsi" w:cstheme="minorBidi"/>
+                <w:noProof/>
+                <w:lang w:eastAsia="sl-SI"/>
+              </w:rPr>
+              <w:tab/>
+            </w:r>
+            <w:r>
+              <w:rPr>
+                <w:rStyle w:val="Hiperpovezava"/>
+                <w:noProof/>
+              </w:rPr>
+              <w:t>Mehanike robota</w:t>
+            </w:r>
+            <w:r>
+              <w:rPr>
+                <w:noProof/>
+                <w:webHidden/>
+              </w:rPr>
+              <w:tab/>
+            </w:r>
+            <w:r>
+              <w:rPr>
+                <w:noProof/>
+                <w:webHidden/>
+              </w:rPr>
+              <w:fldChar w:fldCharType="begin"/>
+            </w:r>
+            <w:r>
+              <w:rPr>
+                <w:noProof/>
+                <w:webHidden/>
+              </w:rPr>
+              <w:instrText xml:space="preserve"> PAGEREF _Toc195559134 \h </w:instrText>
+            </w:r>
+            <w:r>
+              <w:rPr>
+                <w:noProof/>
+                <w:webHidden/>
+              </w:rPr>
+            </w:r>
+            <w:r>
+              <w:rPr>
+                <w:noProof/>
+                <w:webHidden/>
+              </w:rPr>
+              <w:fldChar w:fldCharType="separate"/>
+            </w:r>
+            <w:r>
+              <w:rPr>
+                <w:noProof/>
+                <w:webHidden/>
+              </w:rPr>
+              <w:t>5</w:t>
+            </w:r>
+            <w:r>
+              <w:rPr>
+                <w:noProof/>
+                <w:webHidden/>
+              </w:rPr>
+              <w:fldChar w:fldCharType="end"/>
+            </w:r>
+          </w:hyperlink>
+        </w:p>
+        <w:p>
+          <w:pPr>
+            <w:pStyle w:val="Kazalovsebine3"/>
+            <w:tabs>
+              <w:tab w:val="left" w:pos="1440"/>
+              <w:tab w:val="right" w:leader="dot" w:pos="9016"/>
+            </w:tabs>
+            <w:rPr>
+              <w:rFonts w:asciiTheme="minorHAnsi" w:eastAsiaTheme="minorEastAsia" w:hAnsiTheme="minorHAnsi" w:cstheme="minorBidi"/>
+              <w:noProof/>
+              <w:lang w:eastAsia="sl-SI"/>
+            </w:rPr>
+          </w:pPr>
+          <w:hyperlink w:anchor="_Toc195559135" w:history="1">
+            <w:r>
+              <w:rPr>
+                <w:rStyle w:val="Hiperpovezava"/>
+                <w:noProof/>
+              </w:rPr>
+              <w:t>3.1.3</w:t>
+            </w:r>
+            <w:r>
+              <w:rPr>
+                <w:rFonts w:asciiTheme="minorHAnsi" w:eastAsiaTheme="minorEastAsia" w:hAnsiTheme="minorHAnsi" w:cstheme="minorBidi"/>
+                <w:noProof/>
+                <w:lang w:eastAsia="sl-SI"/>
+              </w:rPr>
+              <w:tab/>
+            </w:r>
+            <w:r>
+              <w:rPr>
+                <w:rStyle w:val="Hiperpovezava"/>
+                <w:noProof/>
+              </w:rPr>
+              <w:t>Mehanike predmetov</w:t>
+            </w:r>
+            <w:r>
+              <w:rPr>
+                <w:noProof/>
+                <w:webHidden/>
+              </w:rPr>
+              <w:tab/>
+            </w:r>
+            <w:r>
+              <w:rPr>
+                <w:noProof/>
+                <w:webHidden/>
+              </w:rPr>
+              <w:fldChar w:fldCharType="begin"/>
+            </w:r>
+            <w:r>
+              <w:rPr>
+                <w:noProof/>
+                <w:webHidden/>
+              </w:rPr>
+              <w:instrText xml:space="preserve"> PAGEREF _Toc195559135 \h </w:instrText>
+            </w:r>
+            <w:r>
+              <w:rPr>
+                <w:noProof/>
+                <w:webHidden/>
+              </w:rPr>
+            </w:r>
+            <w:r>
+              <w:rPr>
+                <w:noProof/>
+                <w:webHidden/>
+              </w:rPr>
+              <w:fldChar w:fldCharType="separate"/>
+            </w:r>
+            <w:r>
+              <w:rPr>
+                <w:noProof/>
+                <w:webHidden/>
+              </w:rPr>
+              <w:t>5</w:t>
+            </w:r>
+            <w:r>
+              <w:rPr>
+                <w:noProof/>
+                <w:webHidden/>
+              </w:rPr>
+              <w:fldChar w:fldCharType="end"/>
+            </w:r>
+          </w:hyperlink>
+        </w:p>
+        <w:p>
+          <w:pPr>
+            <w:pStyle w:val="Kazalovsebine3"/>
+            <w:tabs>
+              <w:tab w:val="left" w:pos="1440"/>
+              <w:tab w:val="right" w:leader="dot" w:pos="9016"/>
+            </w:tabs>
+            <w:rPr>
+              <w:rFonts w:asciiTheme="minorHAnsi" w:eastAsiaTheme="minorEastAsia" w:hAnsiTheme="minorHAnsi" w:cstheme="minorBidi"/>
+              <w:noProof/>
+              <w:lang w:eastAsia="sl-SI"/>
+            </w:rPr>
+          </w:pPr>
+          <w:hyperlink w:anchor="_Toc195559136" w:history="1">
+            <w:r>
+              <w:rPr>
+                <w:rStyle w:val="Hiperpovezava"/>
+                <w:noProof/>
+              </w:rPr>
+              <w:t>3.1.4</w:t>
+            </w:r>
+            <w:r>
+              <w:rPr>
+                <w:rFonts w:asciiTheme="minorHAnsi" w:eastAsiaTheme="minorEastAsia" w:hAnsiTheme="minorHAnsi" w:cstheme="minorBidi"/>
+                <w:noProof/>
+                <w:lang w:eastAsia="sl-SI"/>
+              </w:rPr>
+              <w:tab/>
+            </w:r>
+            <w:r>
+              <w:rPr>
+                <w:rStyle w:val="Hiperpovezava"/>
+                <w:noProof/>
+              </w:rPr>
+              <w:t>Mehanika uporabniškega vmesnika</w:t>
+            </w:r>
+            <w:r>
+              <w:rPr>
+                <w:noProof/>
+                <w:webHidden/>
+              </w:rPr>
+              <w:tab/>
+            </w:r>
+            <w:r>
+              <w:rPr>
+                <w:noProof/>
+                <w:webHidden/>
+              </w:rPr>
+              <w:fldChar w:fldCharType="begin"/>
+            </w:r>
+            <w:r>
+              <w:rPr>
+                <w:noProof/>
+                <w:webHidden/>
+              </w:rPr>
+              <w:instrText xml:space="preserve"> PAGEREF _Toc195559136 \h </w:instrText>
+            </w:r>
+            <w:r>
+              <w:rPr>
+                <w:noProof/>
+                <w:webHidden/>
+              </w:rPr>
+            </w:r>
+            <w:r>
+              <w:rPr>
+                <w:noProof/>
+                <w:webHidden/>
+              </w:rPr>
+              <w:fldChar w:fldCharType="separate"/>
+            </w:r>
+            <w:r>
+              <w:rPr>
+                <w:noProof/>
+                <w:webHidden/>
+              </w:rPr>
+              <w:t>5</w:t>
+            </w:r>
+            <w:r>
+              <w:rPr>
+                <w:noProof/>
+                <w:webHidden/>
+              </w:rPr>
+              <w:fldChar w:fldCharType="end"/>
+            </w:r>
+          </w:hyperlink>
+        </w:p>
+        <w:p>
+          <w:pPr>
+            <w:pStyle w:val="Kazalovsebine2"/>
+            <w:tabs>
+              <w:tab w:val="left" w:pos="960"/>
+              <w:tab w:val="right" w:leader="dot" w:pos="9016"/>
+            </w:tabs>
+            <w:rPr>
+              <w:rFonts w:asciiTheme="minorHAnsi" w:eastAsiaTheme="minorEastAsia" w:hAnsiTheme="minorHAnsi" w:cstheme="minorBidi"/>
+              <w:noProof/>
+              <w:lang w:eastAsia="sl-SI"/>
+            </w:rPr>
+          </w:pPr>
+          <w:hyperlink w:anchor="_Toc195559137" w:history="1">
+            <w:r>
+              <w:rPr>
+                <w:rStyle w:val="Hiperpovezava"/>
+                <w:noProof/>
+              </w:rPr>
+              <w:t>3.2</w:t>
+            </w:r>
+            <w:r>
+              <w:rPr>
+                <w:rFonts w:asciiTheme="minorHAnsi" w:eastAsiaTheme="minorEastAsia" w:hAnsiTheme="minorHAnsi" w:cstheme="minorBidi"/>
+                <w:noProof/>
+                <w:lang w:eastAsia="sl-SI"/>
+              </w:rPr>
+              <w:tab/>
+            </w:r>
+            <w:r>
+              <w:rPr>
+                <w:rStyle w:val="Hiperpovezava"/>
+                <w:noProof/>
+              </w:rPr>
+              <w:t>Uporabljena orodja</w:t>
+            </w:r>
+            <w:r>
+              <w:rPr>
+                <w:noProof/>
+                <w:webHidden/>
+              </w:rPr>
+              <w:tab/>
+            </w:r>
+            <w:r>
+              <w:rPr>
+                <w:noProof/>
+                <w:webHidden/>
+              </w:rPr>
+              <w:fldChar w:fldCharType="begin"/>
+            </w:r>
+            <w:r>
+              <w:rPr>
+                <w:noProof/>
+                <w:webHidden/>
+              </w:rPr>
+              <w:instrText xml:space="preserve"> PAGEREF _Toc195559137 \h </w:instrText>
+            </w:r>
+            <w:r>
+              <w:rPr>
+                <w:noProof/>
+                <w:webHidden/>
+              </w:rPr>
+            </w:r>
+            <w:r>
+              <w:rPr>
+                <w:noProof/>
+                <w:webHidden/>
+              </w:rPr>
+              <w:fldChar w:fldCharType="separate"/>
+            </w:r>
+            <w:r>
+              <w:rPr>
+                <w:noProof/>
+                <w:webHidden/>
+              </w:rPr>
+              <w:t>6</w:t>
+            </w:r>
+            <w:r>
+              <w:rPr>
+                <w:noProof/>
+                <w:webHidden/>
+              </w:rPr>
+              <w:fldChar w:fldCharType="end"/>
+            </w:r>
+          </w:hyperlink>
+        </w:p>
+        <w:p>
+          <w:pPr>
+            <w:pStyle w:val="Kazalovsebine3"/>
+            <w:tabs>
+              <w:tab w:val="left" w:pos="1440"/>
+              <w:tab w:val="right" w:leader="dot" w:pos="9016"/>
+            </w:tabs>
+            <w:rPr>
+              <w:rFonts w:asciiTheme="minorHAnsi" w:eastAsiaTheme="minorEastAsia" w:hAnsiTheme="minorHAnsi" w:cstheme="minorBidi"/>
+              <w:noProof/>
+              <w:lang w:eastAsia="sl-SI"/>
+            </w:rPr>
+          </w:pPr>
+          <w:hyperlink w:anchor="_Toc195559138" w:history="1">
+            <w:r>
+              <w:rPr>
+                <w:rStyle w:val="Hiperpovezava"/>
+                <w:noProof/>
+              </w:rPr>
+              <w:t>3.2.1</w:t>
+            </w:r>
+            <w:r>
+              <w:rPr>
+                <w:rFonts w:asciiTheme="minorHAnsi" w:eastAsiaTheme="minorEastAsia" w:hAnsiTheme="minorHAnsi" w:cstheme="minorBidi"/>
+                <w:noProof/>
+                <w:lang w:eastAsia="sl-SI"/>
+              </w:rPr>
+              <w:tab/>
+            </w:r>
+            <w:r>
+              <w:rPr>
+                <w:rStyle w:val="Hiperpovezava"/>
+                <w:noProof/>
+              </w:rPr>
+              <w:t>Unity 2022 LTS</w:t>
+            </w:r>
+            <w:r>
+              <w:rPr>
+                <w:noProof/>
+                <w:webHidden/>
+              </w:rPr>
+              <w:tab/>
+            </w:r>
+            <w:r>
+              <w:rPr>
+                <w:noProof/>
+                <w:webHidden/>
+              </w:rPr>
+              <w:fldChar w:fldCharType="begin"/>
+            </w:r>
+            <w:r>
+              <w:rPr>
+                <w:noProof/>
+                <w:webHidden/>
+              </w:rPr>
+              <w:instrText xml:space="preserve"> PAGEREF _Toc195559138 \h </w:instrText>
+            </w:r>
+            <w:r>
+              <w:rPr>
+                <w:noProof/>
+                <w:webHidden/>
+              </w:rPr>
+            </w:r>
+            <w:r>
+              <w:rPr>
+                <w:noProof/>
+                <w:webHidden/>
+              </w:rPr>
+              <w:fldChar w:fldCharType="separate"/>
+            </w:r>
+            <w:r>
+              <w:rPr>
+                <w:noProof/>
+                <w:webHidden/>
+              </w:rPr>
+              <w:t>6</w:t>
+            </w:r>
+            <w:r>
+              <w:rPr>
+                <w:noProof/>
+                <w:webHidden/>
+              </w:rPr>
+              <w:fldChar w:fldCharType="end"/>
+            </w:r>
+          </w:hyperlink>
+        </w:p>
+        <w:p>
+          <w:pPr>
+            <w:pStyle w:val="Kazalovsebine3"/>
+            <w:tabs>
+              <w:tab w:val="left" w:pos="1440"/>
+              <w:tab w:val="right" w:leader="dot" w:pos="9016"/>
+            </w:tabs>
+            <w:rPr>
+              <w:rFonts w:asciiTheme="minorHAnsi" w:eastAsiaTheme="minorEastAsia" w:hAnsiTheme="minorHAnsi" w:cstheme="minorBidi"/>
+              <w:noProof/>
+              <w:lang w:eastAsia="sl-SI"/>
+            </w:rPr>
+          </w:pPr>
+          <w:hyperlink w:anchor="_Toc195559139" w:history="1">
+            <w:r>
+              <w:rPr>
+                <w:rStyle w:val="Hiperpovezava"/>
+                <w:noProof/>
+              </w:rPr>
+              <w:t>3.2.2</w:t>
+            </w:r>
+            <w:r>
+              <w:rPr>
+                <w:rFonts w:asciiTheme="minorHAnsi" w:eastAsiaTheme="minorEastAsia" w:hAnsiTheme="minorHAnsi" w:cstheme="minorBidi"/>
+                <w:noProof/>
+                <w:lang w:eastAsia="sl-SI"/>
+              </w:rPr>
+              <w:tab/>
+            </w:r>
+            <w:r>
+              <w:rPr>
+                <w:rStyle w:val="Hiperpovezava"/>
+                <w:noProof/>
+              </w:rPr>
+              <w:t>Visual Studio 2019</w:t>
+            </w:r>
+            <w:r>
+              <w:rPr>
+                <w:noProof/>
+                <w:webHidden/>
+              </w:rPr>
+              <w:tab/>
+            </w:r>
+            <w:r>
+              <w:rPr>
+                <w:noProof/>
+                <w:webHidden/>
+              </w:rPr>
+              <w:fldChar w:fldCharType="begin"/>
+            </w:r>
+            <w:r>
+              <w:rPr>
+                <w:noProof/>
+                <w:webHidden/>
+              </w:rPr>
+              <w:instrText xml:space="preserve"> PAGEREF _Toc195559139 \h </w:instrText>
+            </w:r>
+            <w:r>
+              <w:rPr>
+                <w:noProof/>
+                <w:webHidden/>
+              </w:rPr>
+            </w:r>
+            <w:r>
+              <w:rPr>
+                <w:noProof/>
+                <w:webHidden/>
+              </w:rPr>
+              <w:fldChar w:fldCharType="separate"/>
+            </w:r>
+            <w:r>
+              <w:rPr>
+                <w:noProof/>
+                <w:webHidden/>
+              </w:rPr>
+              <w:t>6</w:t>
+            </w:r>
+            <w:r>
+              <w:rPr>
+                <w:noProof/>
+                <w:webHidden/>
+              </w:rPr>
+              <w:fldChar w:fldCharType="end"/>
+            </w:r>
+          </w:hyperlink>
+        </w:p>
+        <w:p>
+          <w:pPr>
+            <w:pStyle w:val="Kazalovsebine3"/>
+            <w:tabs>
+              <w:tab w:val="left" w:pos="1440"/>
+              <w:tab w:val="right" w:leader="dot" w:pos="9016"/>
+            </w:tabs>
+            <w:rPr>
+              <w:rFonts w:asciiTheme="minorHAnsi" w:eastAsiaTheme="minorEastAsia" w:hAnsiTheme="minorHAnsi" w:cstheme="minorBidi"/>
+              <w:noProof/>
+              <w:lang w:eastAsia="sl-SI"/>
+            </w:rPr>
+          </w:pPr>
+          <w:hyperlink w:anchor="_Toc195559140" w:history="1">
+            <w:r>
+              <w:rPr>
+                <w:rStyle w:val="Hiperpovezava"/>
+                <w:noProof/>
+              </w:rPr>
+              <w:t>3.2.3</w:t>
+            </w:r>
+            <w:r>
+              <w:rPr>
+                <w:rFonts w:asciiTheme="minorHAnsi" w:eastAsiaTheme="minorEastAsia" w:hAnsiTheme="minorHAnsi" w:cstheme="minorBidi"/>
+                <w:noProof/>
+                <w:lang w:eastAsia="sl-SI"/>
+              </w:rPr>
+              <w:tab/>
+            </w:r>
+            <w:r>
+              <w:rPr>
+                <w:rStyle w:val="Hiperpovezava"/>
+                <w:noProof/>
+              </w:rPr>
+              <w:t>GitHub</w:t>
+            </w:r>
+            <w:r>
+              <w:rPr>
+                <w:noProof/>
+                <w:webHidden/>
+              </w:rPr>
+              <w:tab/>
+            </w:r>
+            <w:r>
+              <w:rPr>
+                <w:noProof/>
+                <w:webHidden/>
+              </w:rPr>
+              <w:fldChar w:fldCharType="begin"/>
+            </w:r>
+            <w:r>
+              <w:rPr>
+                <w:noProof/>
+                <w:webHidden/>
+              </w:rPr>
+              <w:instrText xml:space="preserve"> PAGEREF _Toc195559140 \h </w:instrText>
+            </w:r>
+            <w:r>
+              <w:rPr>
+                <w:noProof/>
+                <w:webHidden/>
+              </w:rPr>
+            </w:r>
+            <w:r>
+              <w:rPr>
+                <w:noProof/>
+                <w:webHidden/>
+              </w:rPr>
+              <w:fldChar w:fldCharType="separate"/>
+            </w:r>
+            <w:r>
+              <w:rPr>
+                <w:noProof/>
+                <w:webHidden/>
+              </w:rPr>
+              <w:t>7</w:t>
+            </w:r>
+            <w:r>
+              <w:rPr>
+                <w:noProof/>
+                <w:webHidden/>
+              </w:rPr>
+              <w:fldChar w:fldCharType="end"/>
+            </w:r>
+          </w:hyperlink>
+        </w:p>
+        <w:p>
+          <w:pPr>
+            <w:pStyle w:val="Kazalovsebine1"/>
+            <w:tabs>
+              <w:tab w:val="left" w:pos="480"/>
+              <w:tab w:val="right" w:leader="dot" w:pos="9016"/>
+            </w:tabs>
+            <w:rPr>
+              <w:rFonts w:asciiTheme="minorHAnsi" w:eastAsiaTheme="minorEastAsia" w:hAnsiTheme="minorHAnsi" w:cstheme="minorBidi"/>
+              <w:noProof/>
+              <w:lang w:eastAsia="sl-SI"/>
+            </w:rPr>
+          </w:pPr>
+          <w:hyperlink w:anchor="_Toc195559141" w:history="1">
+            <w:r>
+              <w:rPr>
+                <w:rStyle w:val="Hiperpovezava"/>
+                <w:noProof/>
+              </w:rPr>
+              <w:t>4.</w:t>
+            </w:r>
+            <w:r>
+              <w:rPr>
+                <w:rFonts w:asciiTheme="minorHAnsi" w:eastAsiaTheme="minorEastAsia" w:hAnsiTheme="minorHAnsi" w:cstheme="minorBidi"/>
+                <w:noProof/>
+                <w:lang w:eastAsia="sl-SI"/>
+              </w:rPr>
+              <w:tab/>
+            </w:r>
+            <w:r>
+              <w:rPr>
+                <w:rStyle w:val="Hiperpovezava"/>
+                <w:noProof/>
+              </w:rPr>
+              <w:t>Postopek izdelave</w:t>
+            </w:r>
+            <w:r>
+              <w:rPr>
+                <w:noProof/>
+                <w:webHidden/>
+              </w:rPr>
+              <w:tab/>
+            </w:r>
+            <w:r>
+              <w:rPr>
+                <w:noProof/>
+                <w:webHidden/>
+              </w:rPr>
+              <w:fldChar w:fldCharType="begin"/>
+            </w:r>
+            <w:r>
+              <w:rPr>
+                <w:noProof/>
+                <w:webHidden/>
+              </w:rPr>
+              <w:instrText xml:space="preserve"> PAGEREF _Toc195559141 \h </w:instrText>
+            </w:r>
+            <w:r>
+              <w:rPr>
+                <w:noProof/>
+                <w:webHidden/>
+              </w:rPr>
+            </w:r>
+            <w:r>
+              <w:rPr>
+                <w:noProof/>
+                <w:webHidden/>
+              </w:rPr>
+              <w:fldChar w:fldCharType="separate"/>
+            </w:r>
+            <w:r>
+              <w:rPr>
+                <w:noProof/>
+                <w:webHidden/>
+              </w:rPr>
+              <w:t>7</w:t>
+            </w:r>
+            <w:r>
+              <w:rPr>
+                <w:noProof/>
+                <w:webHidden/>
+              </w:rPr>
+              <w:fldChar w:fldCharType="end"/>
+            </w:r>
+          </w:hyperlink>
+        </w:p>
+        <w:p>
+          <w:pPr>
+            <w:pStyle w:val="Kazalovsebine2"/>
+            <w:tabs>
+              <w:tab w:val="left" w:pos="960"/>
+              <w:tab w:val="right" w:leader="dot" w:pos="9016"/>
+            </w:tabs>
+            <w:rPr>
+              <w:rFonts w:asciiTheme="minorHAnsi" w:eastAsiaTheme="minorEastAsia" w:hAnsiTheme="minorHAnsi" w:cstheme="minorBidi"/>
+              <w:noProof/>
+              <w:lang w:eastAsia="sl-SI"/>
+            </w:rPr>
+          </w:pPr>
+          <w:hyperlink w:anchor="_Toc195559142" w:history="1">
+            <w:r>
+              <w:rPr>
+                <w:rStyle w:val="Hiperpovezava"/>
+                <w:noProof/>
+              </w:rPr>
+              <w:t>4.1</w:t>
+            </w:r>
+            <w:r>
+              <w:rPr>
+                <w:rFonts w:asciiTheme="minorHAnsi" w:eastAsiaTheme="minorEastAsia" w:hAnsiTheme="minorHAnsi" w:cstheme="minorBidi"/>
+                <w:noProof/>
+                <w:lang w:eastAsia="sl-SI"/>
+              </w:rPr>
+              <w:tab/>
+            </w:r>
+            <w:r>
+              <w:rPr>
+                <w:rStyle w:val="Hiperpovezava"/>
+                <w:noProof/>
+              </w:rPr>
+              <w:t>Načrtovanje</w:t>
+            </w:r>
+            <w:r>
+              <w:rPr>
+                <w:noProof/>
+                <w:webHidden/>
+              </w:rPr>
+              <w:tab/>
+            </w:r>
+            <w:r>
+              <w:rPr>
+                <w:noProof/>
+                <w:webHidden/>
+              </w:rPr>
+              <w:fldChar w:fldCharType="begin"/>
+            </w:r>
+            <w:r>
+              <w:rPr>
+                <w:noProof/>
+                <w:webHidden/>
+              </w:rPr>
+              <w:instrText xml:space="preserve"> PAGEREF _Toc195559142 \h </w:instrText>
+            </w:r>
+            <w:r>
+              <w:rPr>
+                <w:noProof/>
+                <w:webHidden/>
+              </w:rPr>
+            </w:r>
+            <w:r>
+              <w:rPr>
+                <w:noProof/>
+                <w:webHidden/>
+              </w:rPr>
+              <w:fldChar w:fldCharType="separate"/>
+            </w:r>
+            <w:r>
+              <w:rPr>
+                <w:noProof/>
+                <w:webHidden/>
+              </w:rPr>
+              <w:t>7</w:t>
+            </w:r>
+            <w:r>
+              <w:rPr>
+                <w:noProof/>
+                <w:webHidden/>
+              </w:rPr>
+              <w:fldChar w:fldCharType="end"/>
+            </w:r>
+          </w:hyperlink>
+        </w:p>
+        <w:p>
+          <w:pPr>
+            <w:pStyle w:val="Kazalovsebine2"/>
+            <w:tabs>
+              <w:tab w:val="left" w:pos="960"/>
+              <w:tab w:val="right" w:leader="dot" w:pos="9016"/>
+            </w:tabs>
+            <w:rPr>
+              <w:rFonts w:asciiTheme="minorHAnsi" w:eastAsiaTheme="minorEastAsia" w:hAnsiTheme="minorHAnsi" w:cstheme="minorBidi"/>
+              <w:noProof/>
+              <w:lang w:eastAsia="sl-SI"/>
+            </w:rPr>
+          </w:pPr>
+          <w:hyperlink w:anchor="_Toc195559143" w:history="1">
+            <w:r>
+              <w:rPr>
+                <w:rStyle w:val="Hiperpovezava"/>
+                <w:noProof/>
+              </w:rPr>
+              <w:t>4.2</w:t>
+            </w:r>
+            <w:r>
+              <w:rPr>
+                <w:rFonts w:asciiTheme="minorHAnsi" w:eastAsiaTheme="minorEastAsia" w:hAnsiTheme="minorHAnsi" w:cstheme="minorBidi"/>
+                <w:noProof/>
+                <w:lang w:eastAsia="sl-SI"/>
+              </w:rPr>
+              <w:tab/>
+            </w:r>
+            <w:r>
+              <w:rPr>
+                <w:rStyle w:val="Hiperpovezava"/>
+                <w:noProof/>
+              </w:rPr>
+              <w:t>Spoznavanje orodja Unity</w:t>
+            </w:r>
+            <w:r>
+              <w:rPr>
+                <w:noProof/>
+                <w:webHidden/>
+              </w:rPr>
+              <w:tab/>
+            </w:r>
+            <w:r>
+              <w:rPr>
+                <w:noProof/>
+                <w:webHidden/>
+              </w:rPr>
+              <w:fldChar w:fldCharType="begin"/>
+            </w:r>
+            <w:r>
+              <w:rPr>
+                <w:noProof/>
+                <w:webHidden/>
+              </w:rPr>
+              <w:instrText xml:space="preserve"> PAGEREF _Toc195559143 \h </w:instrText>
+            </w:r>
+            <w:r>
+              <w:rPr>
+                <w:noProof/>
+                <w:webHidden/>
+              </w:rPr>
+            </w:r>
+            <w:r>
+              <w:rPr>
+                <w:noProof/>
+                <w:webHidden/>
+              </w:rPr>
+              <w:fldChar w:fldCharType="separate"/>
+            </w:r>
+            <w:r>
+              <w:rPr>
+                <w:noProof/>
+                <w:webHidden/>
+              </w:rPr>
+              <w:t>7</w:t>
+            </w:r>
+            <w:r>
+              <w:rPr>
+                <w:noProof/>
+                <w:webHidden/>
+              </w:rPr>
+              <w:fldChar w:fldCharType="end"/>
+            </w:r>
+          </w:hyperlink>
+        </w:p>
+        <w:p>
+          <w:pPr>
+            <w:pStyle w:val="Kazalovsebine2"/>
+            <w:tabs>
+              <w:tab w:val="left" w:pos="960"/>
+              <w:tab w:val="right" w:leader="dot" w:pos="9016"/>
+            </w:tabs>
+            <w:rPr>
+              <w:rFonts w:asciiTheme="minorHAnsi" w:eastAsiaTheme="minorEastAsia" w:hAnsiTheme="minorHAnsi" w:cstheme="minorBidi"/>
+              <w:noProof/>
+              <w:lang w:eastAsia="sl-SI"/>
+            </w:rPr>
+          </w:pPr>
+          <w:hyperlink w:anchor="_Toc195559144" w:history="1">
+            <w:r>
+              <w:rPr>
+                <w:rStyle w:val="Hiperpovezava"/>
+                <w:noProof/>
+              </w:rPr>
+              <w:t>4.3</w:t>
+            </w:r>
+            <w:r>
+              <w:rPr>
+                <w:rFonts w:asciiTheme="minorHAnsi" w:eastAsiaTheme="minorEastAsia" w:hAnsiTheme="minorHAnsi" w:cstheme="minorBidi"/>
+                <w:noProof/>
+                <w:lang w:eastAsia="sl-SI"/>
+              </w:rPr>
+              <w:tab/>
+            </w:r>
+            <w:r>
+              <w:rPr>
+                <w:rStyle w:val="Hiperpovezava"/>
+                <w:noProof/>
+              </w:rPr>
+              <w:t>Izdelava delujočega prototipa</w:t>
+            </w:r>
+            <w:r>
+              <w:rPr>
+                <w:noProof/>
+                <w:webHidden/>
+              </w:rPr>
+              <w:tab/>
+            </w:r>
+            <w:r>
+              <w:rPr>
+                <w:noProof/>
+                <w:webHidden/>
+              </w:rPr>
+              <w:fldChar w:fldCharType="begin"/>
+            </w:r>
+            <w:r>
+              <w:rPr>
+                <w:noProof/>
+                <w:webHidden/>
+              </w:rPr>
+              <w:instrText xml:space="preserve"> PAGEREF _Toc195559144 \h </w:instrText>
+            </w:r>
+            <w:r>
+              <w:rPr>
+                <w:noProof/>
+                <w:webHidden/>
+              </w:rPr>
+            </w:r>
+            <w:r>
+              <w:rPr>
+                <w:noProof/>
+                <w:webHidden/>
+              </w:rPr>
+              <w:fldChar w:fldCharType="separate"/>
+            </w:r>
+            <w:r>
+              <w:rPr>
+                <w:noProof/>
+                <w:webHidden/>
+              </w:rPr>
+              <w:t>8</w:t>
+            </w:r>
+            <w:r>
+              <w:rPr>
+                <w:noProof/>
+                <w:webHidden/>
+              </w:rPr>
+              <w:fldChar w:fldCharType="end"/>
+            </w:r>
+          </w:hyperlink>
+        </w:p>
+        <w:p>
+          <w:pPr>
+            <w:pStyle w:val="Kazalovsebine3"/>
+            <w:tabs>
+              <w:tab w:val="left" w:pos="1440"/>
+              <w:tab w:val="right" w:leader="dot" w:pos="9016"/>
+            </w:tabs>
+            <w:rPr>
+              <w:rFonts w:asciiTheme="minorHAnsi" w:eastAsiaTheme="minorEastAsia" w:hAnsiTheme="minorHAnsi" w:cstheme="minorBidi"/>
+              <w:noProof/>
+              <w:lang w:eastAsia="sl-SI"/>
+            </w:rPr>
+          </w:pPr>
+          <w:hyperlink w:anchor="_Toc195559145" w:history="1">
+            <w:r>
+              <w:rPr>
+                <w:rStyle w:val="Hiperpovezava"/>
+                <w:noProof/>
+              </w:rPr>
+              <w:t>4.3.1</w:t>
+            </w:r>
+            <w:r>
+              <w:rPr>
+                <w:rFonts w:asciiTheme="minorHAnsi" w:eastAsiaTheme="minorEastAsia" w:hAnsiTheme="minorHAnsi" w:cstheme="minorBidi"/>
+                <w:noProof/>
+                <w:lang w:eastAsia="sl-SI"/>
+              </w:rPr>
+              <w:tab/>
+            </w:r>
+            <w:r>
+              <w:rPr>
+                <w:rStyle w:val="Hiperpovezava"/>
+                <w:noProof/>
+              </w:rPr>
+              <w:t>Izdelava prvih prostorov</w:t>
+            </w:r>
+            <w:r>
+              <w:rPr>
+                <w:noProof/>
+                <w:webHidden/>
+              </w:rPr>
+              <w:tab/>
+            </w:r>
+            <w:r>
+              <w:rPr>
+                <w:noProof/>
+                <w:webHidden/>
+              </w:rPr>
+              <w:fldChar w:fldCharType="begin"/>
+            </w:r>
+            <w:r>
+              <w:rPr>
+                <w:noProof/>
+                <w:webHidden/>
+              </w:rPr>
+              <w:instrText xml:space="preserve"> PAGEREF _Toc195559145 \h </w:instrText>
+            </w:r>
+            <w:r>
+              <w:rPr>
+                <w:noProof/>
+                <w:webHidden/>
+              </w:rPr>
+            </w:r>
+            <w:r>
+              <w:rPr>
+                <w:noProof/>
+                <w:webHidden/>
+              </w:rPr>
+              <w:fldChar w:fldCharType="separate"/>
+            </w:r>
+            <w:r>
+              <w:rPr>
+                <w:noProof/>
+                <w:webHidden/>
+              </w:rPr>
+              <w:t>8</w:t>
+            </w:r>
+            <w:r>
+              <w:rPr>
+                <w:noProof/>
+                <w:webHidden/>
+              </w:rPr>
+              <w:fldChar w:fldCharType="end"/>
+            </w:r>
+          </w:hyperlink>
+        </w:p>
+        <w:p>
+          <w:pPr>
+            <w:pStyle w:val="Kazalovsebine3"/>
+            <w:tabs>
+              <w:tab w:val="left" w:pos="1440"/>
+              <w:tab w:val="right" w:leader="dot" w:pos="9016"/>
+            </w:tabs>
+            <w:rPr>
+              <w:rFonts w:asciiTheme="minorHAnsi" w:eastAsiaTheme="minorEastAsia" w:hAnsiTheme="minorHAnsi" w:cstheme="minorBidi"/>
+              <w:noProof/>
+              <w:lang w:eastAsia="sl-SI"/>
+            </w:rPr>
+          </w:pPr>
+          <w:hyperlink w:anchor="_Toc195559146" w:history="1">
+            <w:r>
+              <w:rPr>
+                <w:rStyle w:val="Hiperpovezava"/>
+                <w:noProof/>
+              </w:rPr>
+              <w:t>4.3.2</w:t>
+            </w:r>
+            <w:r>
+              <w:rPr>
+                <w:rFonts w:asciiTheme="minorHAnsi" w:eastAsiaTheme="minorEastAsia" w:hAnsiTheme="minorHAnsi" w:cstheme="minorBidi"/>
+                <w:noProof/>
+                <w:lang w:eastAsia="sl-SI"/>
+              </w:rPr>
+              <w:tab/>
+            </w:r>
+            <w:r>
+              <w:rPr>
+                <w:rStyle w:val="Hiperpovezava"/>
+                <w:noProof/>
+              </w:rPr>
+              <w:t>Glavne funkcionalnosti</w:t>
+            </w:r>
+            <w:r>
+              <w:rPr>
+                <w:noProof/>
+                <w:webHidden/>
+              </w:rPr>
+              <w:tab/>
+            </w:r>
+            <w:r>
+              <w:rPr>
+                <w:noProof/>
+                <w:webHidden/>
+              </w:rPr>
+              <w:fldChar w:fldCharType="begin"/>
+            </w:r>
+            <w:r>
+              <w:rPr>
+                <w:noProof/>
+                <w:webHidden/>
+              </w:rPr>
+              <w:instrText xml:space="preserve"> PAGEREF _Toc195559146 \h </w:instrText>
+            </w:r>
+            <w:r>
+              <w:rPr>
+                <w:noProof/>
+                <w:webHidden/>
+              </w:rPr>
+            </w:r>
+            <w:r>
+              <w:rPr>
+                <w:noProof/>
+                <w:webHidden/>
+              </w:rPr>
+              <w:fldChar w:fldCharType="separate"/>
+            </w:r>
+            <w:r>
+              <w:rPr>
+                <w:noProof/>
+                <w:webHidden/>
+              </w:rPr>
+              <w:t>9</w:t>
+            </w:r>
+            <w:r>
+              <w:rPr>
+                <w:noProof/>
+                <w:webHidden/>
+              </w:rPr>
+              <w:fldChar w:fldCharType="end"/>
+            </w:r>
+          </w:hyperlink>
+        </w:p>
+        <w:p>
+          <w:pPr>
+            <w:pStyle w:val="Kazalovsebine2"/>
+            <w:tabs>
+              <w:tab w:val="left" w:pos="960"/>
+              <w:tab w:val="right" w:leader="dot" w:pos="9016"/>
+            </w:tabs>
+            <w:rPr>
+              <w:rFonts w:asciiTheme="minorHAnsi" w:eastAsiaTheme="minorEastAsia" w:hAnsiTheme="minorHAnsi" w:cstheme="minorBidi"/>
+              <w:noProof/>
+              <w:lang w:eastAsia="sl-SI"/>
+            </w:rPr>
+          </w:pPr>
+          <w:hyperlink w:anchor="_Toc195559147" w:history="1">
+            <w:r>
+              <w:rPr>
+                <w:rStyle w:val="Hiperpovezava"/>
+                <w:noProof/>
+              </w:rPr>
+              <w:t>4.4</w:t>
+            </w:r>
+            <w:r>
+              <w:rPr>
+                <w:rFonts w:asciiTheme="minorHAnsi" w:eastAsiaTheme="minorEastAsia" w:hAnsiTheme="minorHAnsi" w:cstheme="minorBidi"/>
+                <w:noProof/>
+                <w:lang w:eastAsia="sl-SI"/>
+              </w:rPr>
+              <w:tab/>
+            </w:r>
+            <w:r>
+              <w:rPr>
+                <w:rStyle w:val="Hiperpovezava"/>
+                <w:noProof/>
+              </w:rPr>
+              <w:t>Druga faza izdelave</w:t>
+            </w:r>
+            <w:r>
+              <w:rPr>
+                <w:noProof/>
+                <w:webHidden/>
+              </w:rPr>
+              <w:tab/>
+            </w:r>
+            <w:r>
+              <w:rPr>
+                <w:noProof/>
+                <w:webHidden/>
+              </w:rPr>
+              <w:fldChar w:fldCharType="begin"/>
+            </w:r>
+            <w:r>
+              <w:rPr>
+                <w:noProof/>
+                <w:webHidden/>
+              </w:rPr>
+              <w:instrText xml:space="preserve"> PAGEREF _Toc195559147 \h </w:instrText>
+            </w:r>
+            <w:r>
+              <w:rPr>
+                <w:noProof/>
+                <w:webHidden/>
+              </w:rPr>
+            </w:r>
+            <w:r>
+              <w:rPr>
+                <w:noProof/>
+                <w:webHidden/>
+              </w:rPr>
+              <w:fldChar w:fldCharType="separate"/>
+            </w:r>
+            <w:r>
+              <w:rPr>
+                <w:noProof/>
+                <w:webHidden/>
+              </w:rPr>
+              <w:t>10</w:t>
+            </w:r>
+            <w:r>
+              <w:rPr>
+                <w:noProof/>
+                <w:webHidden/>
+              </w:rPr>
+              <w:fldChar w:fldCharType="end"/>
+            </w:r>
+          </w:hyperlink>
+        </w:p>
+        <w:p>
+          <w:r>
+            <w:rPr>
+              <w:b/>
+              <w:bCs/>
+            </w:rPr>
+            <w:fldChar w:fldCharType="end"/>
+          </w:r>
+        </w:p>
+      </w:sdtContent>
+    </w:sdt>
     <w:p>
       <w:pPr>
         <w:pStyle w:val="Naslov1"/>
       </w:pPr>
-      <w:r>
-        <w:lastRenderedPageBreak/>
-        <w:t>Kazalo</w:t>
-      </w:r>
-    </w:p>
-    <w:p>
-      <w:pPr>
-        <w:pStyle w:val="Naslov1"/>
-      </w:pPr>
-      <w:r>
-        <w:t xml:space="preserve"> </w:t>
-      </w:r>
     </w:p>
     <w:p>
       <w:pPr>
@@ -388,10 +2133,12 @@
           <w:numId w:val="6"/>
         </w:numPr>
       </w:pPr>
+      <w:bookmarkStart w:id="0" w:name="_Toc195559129"/>
       <w:r>
         <w:lastRenderedPageBreak/>
         <w:t>Povzetek</w:t>
       </w:r>
+      <w:bookmarkEnd w:id="0"/>
     </w:p>
     <w:p>
       <w:pPr>
@@ -413,6 +2160,7 @@
           <w:numId w:val="13"/>
         </w:numPr>
       </w:pPr>
+      <w:bookmarkStart w:id="1" w:name="_Toc195559130"/>
       <w:r>
         <w:lastRenderedPageBreak/>
         <w:t>Uvo</w:t>
@@ -420,6 +2168,7 @@
       <w:r>
         <w:t>d</w:t>
       </w:r>
+      <w:bookmarkEnd w:id="1"/>
     </w:p>
     <w:p>
       <w:r>
@@ -520,6 +2269,7 @@
           <w:numId w:val="13"/>
         </w:numPr>
       </w:pPr>
+      <w:bookmarkStart w:id="2" w:name="_Toc195559131"/>
       <w:r>
         <w:lastRenderedPageBreak/>
         <w:t>Opis projekt</w:t>
@@ -527,14 +2277,17 @@
       <w:r>
         <w:t>a</w:t>
       </w:r>
+      <w:bookmarkEnd w:id="2"/>
     </w:p>
     <w:p>
       <w:pPr>
         <w:pStyle w:val="Naslov2"/>
       </w:pPr>
+      <w:bookmarkStart w:id="3" w:name="_Toc195559132"/>
       <w:r>
         <w:t>Ključne mehanike</w:t>
       </w:r>
+      <w:bookmarkEnd w:id="3"/>
     </w:p>
     <w:p>
       <w:pPr>
@@ -544,9 +2297,11 @@
           <w:numId w:val="13"/>
         </w:numPr>
       </w:pPr>
+      <w:bookmarkStart w:id="4" w:name="_Toc195559133"/>
       <w:r>
         <w:t>Mehanike igralca</w:t>
       </w:r>
+      <w:bookmarkEnd w:id="4"/>
     </w:p>
     <w:p>
       <w:pPr>
@@ -606,9 +2361,11 @@
           <w:numId w:val="13"/>
         </w:numPr>
       </w:pPr>
+      <w:bookmarkStart w:id="5" w:name="_Toc195559134"/>
       <w:r>
         <w:t>Mehanike robota</w:t>
       </w:r>
+      <w:bookmarkEnd w:id="5"/>
     </w:p>
     <w:p>
       <w:pPr>
@@ -688,12 +2445,14 @@
           <w:numId w:val="13"/>
         </w:numPr>
       </w:pPr>
+      <w:bookmarkStart w:id="6" w:name="_Toc195559135"/>
       <w:r>
         <w:t xml:space="preserve">Mehanike </w:t>
       </w:r>
       <w:r>
         <w:t>predmetov</w:t>
       </w:r>
+      <w:bookmarkEnd w:id="6"/>
     </w:p>
     <w:p>
       <w:pPr>
@@ -769,9 +2528,11 @@
           <w:numId w:val="13"/>
         </w:numPr>
       </w:pPr>
+      <w:bookmarkStart w:id="7" w:name="_Toc195559136"/>
       <w:r>
         <w:t>Mehanika uporabniškega vmesnika</w:t>
       </w:r>
+      <w:bookmarkEnd w:id="7"/>
     </w:p>
     <w:p>
       <w:pPr>
@@ -814,10 +2575,12 @@
       <w:pPr>
         <w:pStyle w:val="Naslov2"/>
       </w:pPr>
+      <w:bookmarkStart w:id="8" w:name="_Toc195559137"/>
       <w:r>
         <w:lastRenderedPageBreak/>
         <w:t>Uporabljena orodja</w:t>
       </w:r>
+      <w:bookmarkEnd w:id="8"/>
     </w:p>
     <w:p>
       <w:pPr>
@@ -877,6 +2640,7 @@
           <w:numId w:val="13"/>
         </w:numPr>
       </w:pPr>
+      <w:bookmarkStart w:id="9" w:name="_Toc195559138"/>
       <w:proofErr w:type="spellStart"/>
       <w:r>
         <w:t>Unity</w:t>
@@ -885,6 +2649,7 @@
       <w:r>
         <w:t xml:space="preserve"> 2022 LTS</w:t>
       </w:r>
+      <w:bookmarkEnd w:id="9"/>
     </w:p>
     <w:p>
       <w:pPr>
@@ -1082,6 +2847,7 @@
           <w:numId w:val="13"/>
         </w:numPr>
       </w:pPr>
+      <w:bookmarkStart w:id="10" w:name="_Toc195559139"/>
       <w:proofErr w:type="spellStart"/>
       <w:r>
         <w:t>Visual</w:t>
@@ -1105,6 +2871,7 @@
       <w:r>
         <w:t>19</w:t>
       </w:r>
+      <w:bookmarkEnd w:id="10"/>
     </w:p>
     <w:p>
       <w:pPr>
@@ -1308,10 +3075,12 @@
           <w:numId w:val="13"/>
         </w:numPr>
       </w:pPr>
+      <w:bookmarkStart w:id="11" w:name="_Toc195559140"/>
       <w:proofErr w:type="spellStart"/>
       <w:r>
         <w:t>GitHub</w:t>
       </w:r>
+      <w:bookmarkEnd w:id="11"/>
       <w:proofErr w:type="spellEnd"/>
       <w:r>
         <w:t xml:space="preserve"> </w:t>
@@ -1324,16 +3093,16 @@
       <w:r>
         <w:t xml:space="preserve">LOREM </w:t>
       </w:r>
-      <w:commentRangeStart w:id="0"/>
+      <w:commentRangeStart w:id="12"/>
       <w:r>
         <w:t>IPSUM</w:t>
       </w:r>
-      <w:commentRangeEnd w:id="0"/>
+      <w:commentRangeEnd w:id="12"/>
       <w:r>
         <w:rPr>
           <w:rStyle w:val="Pripombasklic"/>
         </w:rPr>
-        <w:commentReference w:id="0"/>
+        <w:commentReference w:id="12"/>
       </w:r>
     </w:p>
     <w:p>
@@ -1344,17 +3113,21 @@
           <w:numId w:val="13"/>
         </w:numPr>
       </w:pPr>
+      <w:bookmarkStart w:id="13" w:name="_Toc195559141"/>
       <w:r>
         <w:t>Postopek izdelave</w:t>
       </w:r>
+      <w:bookmarkEnd w:id="13"/>
     </w:p>
     <w:p>
       <w:pPr>
         <w:pStyle w:val="Naslov2"/>
       </w:pPr>
+      <w:bookmarkStart w:id="14" w:name="_Toc195559142"/>
       <w:r>
         <w:t>Načrtovanje</w:t>
       </w:r>
+      <w:bookmarkEnd w:id="14"/>
     </w:p>
     <w:p>
       <w:pPr>
@@ -1430,6 +3203,7 @@
       <w:pPr>
         <w:pStyle w:val="Naslov2"/>
       </w:pPr>
+      <w:bookmarkStart w:id="15" w:name="_Toc195559143"/>
       <w:r>
         <w:t xml:space="preserve">Spoznavanje orodja </w:t>
       </w:r>
@@ -1437,6 +3211,7 @@
       <w:r>
         <w:t>Unity</w:t>
       </w:r>
+      <w:bookmarkEnd w:id="15"/>
       <w:proofErr w:type="spellEnd"/>
     </w:p>
     <w:p>
@@ -1539,10 +3314,7 @@
         <w:t>To je predstavljalo osnovo za testiranje drugih mehanik, kot so interakcija s predmeti, zaznavanje svetlobe in delovanje sovražnika.</w:t>
       </w:r>
       <w:r>
-        <w:t xml:space="preserve"> </w:t>
-      </w:r>
-      <w:r>
-        <w:t xml:space="preserve">Ko sem pridobil več znanja in boljše razumevanje principov objektno usmerjenega programiranja znotraj </w:t>
+        <w:t xml:space="preserve"> Ko sem pridobil več znanja in boljše razumevanje principov objektno usmerjenega programiranja znotraj </w:t>
       </w:r>
       <w:proofErr w:type="spellStart"/>
       <w:r>
@@ -1576,6 +3348,7 @@
       <w:pPr>
         <w:pStyle w:val="Naslov2"/>
       </w:pPr>
+      <w:bookmarkStart w:id="16" w:name="_Toc195559144"/>
       <w:r>
         <w:lastRenderedPageBreak/>
         <w:t xml:space="preserve">Izdelava </w:t>
@@ -1586,6 +3359,7 @@
       <w:r>
         <w:t>prototipa</w:t>
       </w:r>
+      <w:bookmarkEnd w:id="16"/>
     </w:p>
     <w:p>
       <w:pPr>
@@ -1649,6 +3423,7 @@
           <w:numId w:val="13"/>
         </w:numPr>
       </w:pPr>
+      <w:bookmarkStart w:id="17" w:name="_Toc195559145"/>
       <w:r>
         <w:t xml:space="preserve">Izdelava </w:t>
       </w:r>
@@ -1667,6 +3442,7 @@
       <w:r>
         <w:t>ov</w:t>
       </w:r>
+      <w:bookmarkEnd w:id="17"/>
     </w:p>
     <w:p>
       <w:pPr>
@@ -1742,16 +3518,16 @@
       <w:r>
         <w:t xml:space="preserve">, vendar ga je potrebno </w:t>
       </w:r>
-      <w:commentRangeStart w:id="1"/>
+      <w:commentRangeStart w:id="18"/>
       <w:r>
         <w:t>naložiti</w:t>
       </w:r>
-      <w:commentRangeEnd w:id="1"/>
+      <w:commentRangeEnd w:id="18"/>
       <w:r>
         <w:rPr>
           <w:rStyle w:val="Pripombasklic"/>
         </w:rPr>
-        <w:commentReference w:id="1"/>
+        <w:commentReference w:id="18"/>
       </w:r>
       <w:r>
         <w:t>.</w:t>
@@ -1876,6 +3652,108 @@
       </w:r>
       <w:r>
         <w:t>opazuje različne dele zapora in planira svojo naslednjo pot.</w:t>
+      </w:r>
+    </w:p>
+    <w:p>
+      <w:pPr>
+        <w:ind w:left="360"/>
+      </w:pPr>
+      <w:r>
+        <w:rPr>
+          <w:rStyle w:val="Krepko"/>
+          <w:b w:val="0"/>
+          <w:bCs w:val="0"/>
+        </w:rPr>
+        <w:t xml:space="preserve">Sobo </w:t>
+      </w:r>
+      <w:r>
+        <w:rPr>
+          <w:rStyle w:val="Krepko"/>
+          <w:b w:val="0"/>
+          <w:bCs w:val="0"/>
+        </w:rPr>
+        <w:t>je manjša. V</w:t>
+      </w:r>
+      <w:r>
+        <w:rPr>
+          <w:rStyle w:val="Krepko"/>
+          <w:b w:val="0"/>
+          <w:bCs w:val="0"/>
+        </w:rPr>
+        <w:t xml:space="preserve">anjo </w:t>
+      </w:r>
+      <w:r>
+        <w:rPr>
+          <w:rStyle w:val="Krepko"/>
+          <w:b w:val="0"/>
+          <w:bCs w:val="0"/>
+        </w:rPr>
+        <w:t xml:space="preserve">sem </w:t>
+      </w:r>
+      <w:r>
+        <w:rPr>
+          <w:rStyle w:val="Krepko"/>
+          <w:b w:val="0"/>
+          <w:bCs w:val="0"/>
+        </w:rPr>
+        <w:t>dodal 3D</w:t>
+      </w:r>
+      <w:r>
+        <w:rPr>
+          <w:rStyle w:val="Krepko"/>
+          <w:b w:val="0"/>
+          <w:bCs w:val="0"/>
+        </w:rPr>
+        <w:t xml:space="preserve"> pisarniške modele</w:t>
+      </w:r>
+      <w:r>
+        <w:rPr>
+          <w:rStyle w:val="Krepko"/>
+          <w:b w:val="0"/>
+          <w:bCs w:val="0"/>
+        </w:rPr>
+        <w:t>.</w:t>
+      </w:r>
+      <w:r>
+        <w:rPr>
+          <w:rStyle w:val="Krepko"/>
+          <w:b w:val="0"/>
+          <w:bCs w:val="0"/>
+        </w:rPr>
+        <w:t xml:space="preserve"> To so miza, stol, računalniška periferija in nekaj drugih okrasnih predmetov.</w:t>
+      </w:r>
+      <w:r>
+        <w:rPr>
+          <w:rStyle w:val="Krepko"/>
+          <w:b w:val="0"/>
+          <w:bCs w:val="0"/>
+        </w:rPr>
+        <w:t xml:space="preserve"> V sobo sem dodal tudi 3D model mrtvega paznika, ki je v roki držal ključ</w:t>
+      </w:r>
+      <w:r>
+        <w:rPr>
+          <w:rStyle w:val="Krepko"/>
+          <w:b w:val="0"/>
+          <w:bCs w:val="0"/>
+        </w:rPr>
+        <w:t>, ki ga igralec lahko pobere.</w:t>
+      </w:r>
+      <w:r>
+        <w:rPr>
+          <w:rStyle w:val="Krepko"/>
+          <w:b w:val="0"/>
+          <w:bCs w:val="0"/>
+        </w:rPr>
+        <w:t xml:space="preserve"> N</w:t>
+      </w:r>
+      <w:r>
+        <w:t xml:space="preserve">apisal </w:t>
+      </w:r>
+      <w:r>
+        <w:t xml:space="preserve">sem </w:t>
+      </w:r>
+      <w:r>
+        <w:t xml:space="preserve">logiko, ki je igralcu omogočala menjavo med pogledi različnih kamer v zaporu. </w:t>
       </w:r>
     </w:p>
     <w:p>
@@ -1887,62 +3765,6 @@
           <w:bCs w:val="0"/>
         </w:rPr>
       </w:pPr>
-      <w:r>
-        <w:rPr>
-          <w:rStyle w:val="Krepko"/>
-          <w:b w:val="0"/>
-          <w:bCs w:val="0"/>
-        </w:rPr>
-        <w:t>Sobo sem naredil manjšo in vanjo dodal 3D</w:t>
-      </w:r>
-      <w:r>
-        <w:rPr>
-          <w:rStyle w:val="Krepko"/>
-          <w:b w:val="0"/>
-          <w:bCs w:val="0"/>
-        </w:rPr>
-        <w:t xml:space="preserve"> pisarniške modele</w:t>
-      </w:r>
-      <w:r>
-        <w:rPr>
-          <w:rStyle w:val="Krepko"/>
-          <w:b w:val="0"/>
-          <w:bCs w:val="0"/>
-        </w:rPr>
-        <w:t>.</w:t>
-      </w:r>
-      <w:r>
-        <w:rPr>
-          <w:rStyle w:val="Krepko"/>
-          <w:b w:val="0"/>
-          <w:bCs w:val="0"/>
-        </w:rPr>
-        <w:t xml:space="preserve"> To so miza, stol, računalniška periferija in nekaj drugih okrasnih predmetov.</w:t>
-      </w:r>
-      <w:r>
-        <w:rPr>
-          <w:rStyle w:val="Krepko"/>
-          <w:b w:val="0"/>
-          <w:bCs w:val="0"/>
-        </w:rPr>
-        <w:t xml:space="preserve"> V sobo sem dodal tudi 3D model mrtvega paznika, ki je v roki držal ključ</w:t>
-      </w:r>
-      <w:r>
-        <w:rPr>
-          <w:rStyle w:val="Krepko"/>
-          <w:b w:val="0"/>
-          <w:bCs w:val="0"/>
-        </w:rPr>
-        <w:t>, ki ga igralec lahko pobere.</w:t>
-      </w:r>
-      <w:r>
-        <w:rPr>
-          <w:rStyle w:val="Krepko"/>
-          <w:b w:val="0"/>
-          <w:bCs w:val="0"/>
-        </w:rPr>
-        <w:t xml:space="preserve"> </w:t>
-      </w:r>
       <w:r>
         <w:rPr>
           <w:rStyle w:val="Krepko"/>
@@ -1977,9 +3799,13 @@
           <w:rStyle w:val="Naslov4Znak"/>
         </w:rPr>
       </w:pPr>
+      <w:bookmarkStart w:id="19" w:name="_Toc195559146"/>
       <w:r>
         <w:lastRenderedPageBreak/>
-        <w:t>Glavne funkci</w:t>
+        <w:t xml:space="preserve">Ločene </w:t>
+      </w:r>
+      <w:r>
+        <w:t>funkci</w:t>
       </w:r>
       <w:r>
         <w:rPr>
@@ -1987,6 +3813,7 @@
         </w:rPr>
         <w:t>onalnosti</w:t>
       </w:r>
+      <w:bookmarkEnd w:id="19"/>
     </w:p>
     <w:p>
       <w:pPr>
@@ -1999,7 +3826,10 @@
         <w:t>Ko sem imel prostor za testiranje (skladiščna soba)</w:t>
       </w:r>
       <w:r>
-        <w:t>, sem se lotil izdelave umetne inteligence robota.</w:t>
+        <w:t xml:space="preserve">, sem se lotil </w:t>
+      </w:r>
+      <w:r>
+        <w:t xml:space="preserve">pisanju novih funkcionalnosti. Najbolj pomembna je Umetna inteligenca robota. </w:t>
       </w:r>
     </w:p>
     <w:p>
@@ -2327,7 +4157,7 @@
         <w:rPr>
           <w:rStyle w:val="Krepko"/>
         </w:rPr>
-        <w:t>Računalnik v sobi za videonadzor</w:t>
+        <w:t>Pištola za kratko onemogočitev robota in naboji</w:t>
       </w:r>
     </w:p>
     <w:p>
@@ -2335,10 +4165,60 @@
         <w:ind w:left="360"/>
       </w:pPr>
       <w:r>
-        <w:t>V sobi za videonadzor, sem napisal logiko, ki je igralcu omogočala menjavo med pogledi različnih kamer v zaporu.</w:t>
+        <w:t xml:space="preserve">S pomočjo </w:t>
+      </w:r>
+      <w:r>
+        <w:t xml:space="preserve">interakcijskega sistema, sem lahko naredil pištolo, iz katere </w:t>
+      </w:r>
+      <w:r>
+        <w:t xml:space="preserve">je </w:t>
+      </w:r>
+      <w:r>
+        <w:t>igralec ustreli</w:t>
+      </w:r>
+      <w:r>
+        <w:t>l</w:t>
+      </w:r>
+      <w:r>
+        <w:t xml:space="preserve"> naboje, ki</w:t>
+      </w:r>
+      <w:r>
+        <w:t xml:space="preserve"> jih najde v različnih prostorih.</w:t>
       </w:r>
       <w:r>
         <w:t xml:space="preserve"> </w:t>
+      </w:r>
+      <w:r>
+        <w:t>Ko je naboj robota zadel, se je izvajanje njegove skripte ustavilo za določen čas.</w:t>
+      </w:r>
+      <w:r>
+        <w:t xml:space="preserve"> </w:t>
+      </w:r>
+      <w:r>
+        <w:t>Seveda je lahko puško hranil v inventarju</w:t>
+      </w:r>
+      <w:r>
+        <w:t>.</w:t>
+      </w:r>
+      <w:r>
+        <w:t xml:space="preserve"> </w:t>
+      </w:r>
+      <w:r>
+        <w:t xml:space="preserve"> </w:t>
+      </w:r>
+    </w:p>
+    <w:p>
+      <w:pPr>
+        <w:jc w:val="left"/>
+        <w:rPr>
+          <w:rStyle w:val="Krepko"/>
+        </w:rPr>
+      </w:pPr>
+      <w:r>
+        <w:rPr>
+          <w:rStyle w:val="Krepko"/>
+        </w:rPr>
+        <w:br w:type="page"/>
       </w:r>
     </w:p>
     <w:p>
@@ -2352,7 +4232,8 @@
         <w:rPr>
           <w:rStyle w:val="Krepko"/>
         </w:rPr>
-        <w:t>Pištola za kratko onemogočitev robota in naboji</w:t>
+        <w:lastRenderedPageBreak/>
+        <w:t>Nočna očala</w:t>
       </w:r>
     </w:p>
     <w:p>
@@ -2360,56 +4241,285 @@
         <w:ind w:left="360"/>
       </w:pPr>
       <w:r>
-        <w:t xml:space="preserve">S pomočjo </w:t>
-      </w:r>
-      <w:r>
-        <w:t xml:space="preserve">interakcijskega sistema, sem lahko naredil pištolo, iz katere </w:t>
-      </w:r>
-      <w:r>
-        <w:t xml:space="preserve">je </w:t>
-      </w:r>
-      <w:r>
-        <w:t>igralec ustreli</w:t>
-      </w:r>
-      <w:r>
-        <w:t>l</w:t>
-      </w:r>
-      <w:r>
-        <w:t xml:space="preserve"> naboje, ki</w:t>
-      </w:r>
-      <w:r>
-        <w:t xml:space="preserve"> jih najde v različnih prostorih.</w:t>
+        <w:t>Nočna očala sem povezal v interakcijski sistem nato pa dodal logiko, ki okoli igralca razširi vir svetlobe, ki simulira njegov pogled v temi.</w:t>
+      </w:r>
+      <w:r>
+        <w:t xml:space="preserve"> Tako lahko igralec po temu ko pobere ta očala</w:t>
+      </w:r>
+      <w:r>
+        <w:t xml:space="preserve">, </w:t>
+      </w:r>
+      <w:r>
+        <w:t>vidi dlje.</w:t>
+      </w:r>
+      <w:r>
+        <w:t xml:space="preserve"> Pomembno je da ta očala ne zavzemajo mesta v inventarju, ampak so del igralca odkar jih pobere (ne more jih sneti).</w:t>
       </w:r>
       <w:r>
         <w:t xml:space="preserve"> </w:t>
       </w:r>
-      <w:r>
-        <w:t>Ko je naboj robota zadel, se je izvajanje njegove skripte ustavilo za določen čas.</w:t>
+    </w:p>
+    <w:p>
+      <w:pPr>
+        <w:pStyle w:val="Naslov2"/>
+      </w:pPr>
+      <w:bookmarkStart w:id="20" w:name="_Toc195559147"/>
+      <w:r>
+        <w:t>Druga faza izdelave</w:t>
+      </w:r>
+      <w:bookmarkEnd w:id="20"/>
+    </w:p>
+    <w:p>
+      <w:pPr>
+        <w:ind w:left="360"/>
+        <w:rPr>
+          <w:rStyle w:val="Krepko"/>
+        </w:rPr>
+      </w:pPr>
+      <w:r>
+        <w:t>Ta del izdelave se je začel</w:t>
+      </w:r>
+      <w:r>
+        <w:t xml:space="preserve"> po opravljeni 2. konzultaciji z mentorjem.</w:t>
+      </w:r>
+      <w:r>
+        <w:t xml:space="preserve"> Mentor je potrdil </w:t>
+      </w:r>
+      <w:r>
+        <w:t xml:space="preserve">do sedaj narejene </w:t>
+      </w:r>
+      <w:r>
+        <w:t>stvari in mi naročil naj z delom nadaljujem.</w:t>
+      </w:r>
+      <w:r>
+        <w:t xml:space="preserve"> Zdaj ko so bile glavne funkcionalnosti vzpostavljene, sem lahko začel z razvijanjem mehanik, ki temeljijo na teh glavnih funkcionalnostih</w:t>
+      </w:r>
+      <w:r>
+        <w:t>.</w:t>
+      </w:r>
+      <w:r>
+        <w:t xml:space="preserve"> Dodal sem tudi veliko novih prostorov.</w:t>
       </w:r>
       <w:r>
         <w:t xml:space="preserve"> </w:t>
       </w:r>
-      <w:r>
-        <w:t>Seveda je lahko puško hranil v inventarju</w:t>
-      </w:r>
+    </w:p>
+    <w:p>
+      <w:pPr>
+        <w:pStyle w:val="Naslov4"/>
+      </w:pPr>
+      <w:r>
+        <w:t xml:space="preserve">Izdelava novih </w:t>
+      </w:r>
+      <w:r>
+        <w:t>prostorov</w:t>
+      </w:r>
+    </w:p>
+    <w:p>
+      <w:pPr>
+        <w:ind w:left="360"/>
+      </w:pPr>
+      <w:r>
+        <w:t>Dodal sem vse preostale nove prostore in jih povezal s hodniki.</w:t>
+      </w:r>
+      <w:r>
+        <w:t xml:space="preserve"> Še kar sem uporabljal v prejšnjem poglavju omenjeno orodje </w:t>
+      </w:r>
+      <w:proofErr w:type="spellStart"/>
+      <w:r>
+        <w:t>ProBuilder</w:t>
+      </w:r>
+      <w:proofErr w:type="spellEnd"/>
+      <w:r>
+        <w:t xml:space="preserve"> za hitro</w:t>
+      </w:r>
+      <w:r>
+        <w:t xml:space="preserve"> modeliranje znotraj </w:t>
+      </w:r>
+      <w:proofErr w:type="spellStart"/>
+      <w:r>
+        <w:t>Unityja</w:t>
+      </w:r>
+      <w:proofErr w:type="spellEnd"/>
       <w:r>
         <w:t>.</w:t>
       </w:r>
+    </w:p>
+    <w:p>
+      <w:pPr>
+        <w:ind w:left="360"/>
+        <w:rPr>
+          <w:rStyle w:val="Krepko"/>
+        </w:rPr>
+      </w:pPr>
+      <w:r>
+        <w:rPr>
+          <w:rStyle w:val="Krepko"/>
+        </w:rPr>
+        <w:t>Povečan</w:t>
+      </w:r>
+      <w:r>
+        <w:rPr>
+          <w:rStyle w:val="Krepko"/>
+        </w:rPr>
+        <w:t xml:space="preserve"> skladiščni prostor</w:t>
+      </w:r>
+    </w:p>
+    <w:p>
+      <w:pPr>
+        <w:ind w:left="360"/>
+      </w:pPr>
+      <w:r>
+        <w:t xml:space="preserve">Po mentorjevi povratni informaciji sem povečal </w:t>
+      </w:r>
+      <w:r>
+        <w:t>skladiščno sobo za približno 3x.</w:t>
+      </w:r>
+      <w:r>
+        <w:t xml:space="preserve"> Tako je veliko novih poti, ki jih lahko igralec uporabi.</w:t>
+      </w:r>
+      <w:r>
+        <w:t xml:space="preserve"> Tudi sama navigacija po skladišču je zdaj težja in predstavlja igralcu večji izziv.</w:t>
+      </w:r>
+    </w:p>
+    <w:p>
+      <w:pPr>
+        <w:ind w:left="360"/>
+        <w:rPr>
+          <w:rStyle w:val="Krepko"/>
+        </w:rPr>
+      </w:pPr>
+      <w:r>
+        <w:rPr>
+          <w:rStyle w:val="Krepko"/>
+        </w:rPr>
+        <w:t>Prostor s celicami</w:t>
+      </w:r>
+    </w:p>
+    <w:p>
+      <w:pPr>
+        <w:ind w:left="360"/>
+      </w:pPr>
+      <w:r>
+        <w:t>Dodal sem zelo pomemben prostor, ki je tudi prostor kjer igralec začne igro.</w:t>
+      </w:r>
+      <w:r>
+        <w:t xml:space="preserve"> To sicer ni ločen prostor, ker so kletke postavljene kar ob prehodu, ki povezuje dva druga prostora</w:t>
+      </w:r>
+      <w:r>
+        <w:t>.</w:t>
+      </w:r>
       <w:r>
         <w:t xml:space="preserve"> </w:t>
       </w:r>
       <w:r>
+        <w:t>V celice sem postavil 3D modele postelj in nanje postavil 3D model zapornika</w:t>
+      </w:r>
+      <w:r>
+        <w:t>. Nekatere celice sem pustil prazne, tiste ki pa imajo zapornika pa sem opremil s močno rdečo lučjo ki iz igralčevega vidika paralizirajo zapornike tako da ne morejo pobegniti.</w:t>
+      </w:r>
+      <w:r>
+        <w:t xml:space="preserve"> To je igralčev prvi znak da so luči nevarne.</w:t>
+      </w:r>
+      <w:r>
+        <w:t xml:space="preserve"> Vključil sem tudi </w:t>
+      </w:r>
+      <w:r>
+        <w:t>sistem za interakcijo tako, da lahko igralec prazne celice odpre</w:t>
+      </w:r>
+      <w:r>
+        <w:t xml:space="preserve">. </w:t>
+      </w:r>
+    </w:p>
+    <w:p>
+      <w:pPr>
+        <w:ind w:left="360"/>
+        <w:rPr>
+          <w:rStyle w:val="Krepko"/>
+        </w:rPr>
+      </w:pPr>
+      <w:r>
+        <w:rPr>
+          <w:rStyle w:val="Krepko"/>
+        </w:rPr>
+        <w:t xml:space="preserve">Prostor </w:t>
+      </w:r>
+      <w:r>
+        <w:rPr>
+          <w:rStyle w:val="Krepko"/>
+        </w:rPr>
+        <w:t>z</w:t>
+      </w:r>
+      <w:r>
+        <w:rPr>
+          <w:rStyle w:val="Krepko"/>
+        </w:rPr>
+        <w:t xml:space="preserve"> osebnimi omaricami paznikov</w:t>
+      </w:r>
+    </w:p>
+    <w:p>
+      <w:pPr>
+        <w:ind w:left="360"/>
+      </w:pPr>
+      <w:r>
+        <w:t>Dodal sem prostor, v katerega sem postavil 3D modele omaric</w:t>
+      </w:r>
+      <w:r>
+        <w:t xml:space="preserve">. </w:t>
+      </w:r>
+      <w:r>
+        <w:t>Vanje sem implementiral sistem</w:t>
+      </w:r>
+      <w:r>
+        <w:t xml:space="preserve"> interakcije, tako da lahko igralec vrata omaric odpira in zapira.</w:t>
+      </w:r>
+      <w:r>
+        <w:t xml:space="preserve"> Na dvoje omaric sem dodal tudi ključavnico in zanje napisal potrebne skripte, ki bodo skrbele, da mora igralec ključavnico odkleniti preden jo lahko odpre.</w:t>
+      </w:r>
+      <w:r>
+        <w:t xml:space="preserve"> V prvo omarico sem dodal puško</w:t>
+      </w:r>
+      <w:r>
+        <w:t>, v drugo omarico pa nočna očala.</w:t>
+      </w:r>
+      <w:r>
         <w:t xml:space="preserve"> </w:t>
       </w:r>
     </w:p>
     <w:p>
       <w:pPr>
-        <w:pStyle w:val="Naslov2"/>
-      </w:pPr>
-      <w:r>
-        <w:lastRenderedPageBreak/>
-        <w:t>Druga faza izdelave</w:t>
-      </w:r>
+        <w:ind w:left="360"/>
+        <w:rPr>
+          <w:rStyle w:val="Krepko"/>
+        </w:rPr>
+      </w:pPr>
+      <w:r>
+        <w:rPr>
+          <w:rStyle w:val="Krepko"/>
+        </w:rPr>
+        <w:t xml:space="preserve">Prostor </w:t>
+      </w:r>
+      <w:r>
+        <w:rPr>
+          <w:rStyle w:val="Krepko"/>
+        </w:rPr>
+        <w:t>z vhodom do sobe z omaricami</w:t>
+      </w:r>
+    </w:p>
+    <w:p>
+      <w:pPr>
+        <w:ind w:left="360"/>
+      </w:pPr>
+    </w:p>
+    <w:p>
+      <w:pPr>
+        <w:ind w:left="360"/>
+      </w:pPr>
+    </w:p>
+    <w:p>
+      <w:pPr>
+        <w:ind w:left="360"/>
+      </w:pPr>
     </w:p>
     <w:p>
       <w:pPr>
@@ -2473,7 +4583,7 @@
 
 <file path=word/comments.xml><?xml version="1.0" encoding="utf-8"?>
 <w:comments xmlns:wpc="http://schemas.microsoft.com/office/word/2010/wordprocessingCanvas" xmlns:cx="http://schemas.microsoft.com/office/drawing/2014/chartex" xmlns:cx1="http://schemas.microsoft.com/office/drawing/2015/9/8/chartex" xmlns:cx2="http://schemas.microsoft.com/office/drawing/2015/10/21/chartex" xmlns:cx3="http://schemas.microsoft.com/office/drawing/2016/5/9/chartex" xmlns:cx4="http://schemas.microsoft.com/office/drawing/2016/5/10/chartex" xmlns:cx5="http://schemas.microsoft.com/office/drawing/2016/5/11/chartex" xmlns:cx6="http://schemas.microsoft.com/office/drawing/2016/5/12/chartex" xmlns:cx7="http://schemas.microsoft.com/office/drawing/2016/5/13/chartex" xmlns:cx8="http://schemas.microsoft.com/office/drawing/2016/5/14/chartex" xmlns:mc="http://schemas.openxmlformats.org/markup-compatibility/2006" xmlns:aink="http://schemas.microsoft.com/office/drawing/2016/ink" xmlns:am3d="http://schemas.microsoft.com/office/drawing/2017/model3d" xmlns:o="urn:schemas-microsoft-com:office:office" xmlns:oel="http://schemas.microsoft.com/office/2019/extlst" xmlns:r="http://schemas.openxmlformats.org/officeDocument/2006/relationships" xmlns:m="http://schemas.openxmlformats.org/officeDocument/2006/math" xmlns:v="urn:schemas-microsoft-com:vml" xmlns:wp14="http://schemas.microsoft.com/office/word/2010/wordprocessingDrawing" xmlns:wp="http://schemas.openxmlformats.org/drawingml/2006/wordprocessingDrawing" xmlns:w10="urn:schemas-microsoft-com:office:word" xmlns:w="http://schemas.openxmlformats.org/wordprocessingml/2006/main" xmlns:w14="http://schemas.microsoft.com/office/word/2010/wordml" xmlns:w15="http://schemas.microsoft.com/office/word/2012/wordml" xmlns:w16cex="http://schemas.microsoft.com/office/word/2018/wordml/cex" xmlns:w16cid="http://schemas.microsoft.com/office/word/2016/wordml/cid" xmlns:w16="http://schemas.microsoft.com/office/word/2018/wordml" xmlns:w16du="http://schemas.microsoft.com/office/word/2023/wordml/word16du" xmlns:w16sdtdh="http://schemas.microsoft.com/office/word/2020/wordml/sdtdatahash" xmlns:w16sdtfl="http://schemas.microsoft.com/office/word/2024/wordml/sdtformatlock" xmlns:w16se="http://schemas.microsoft.com/office/word/2015/wordml/symex" xmlns:wpg="http://schemas.microsoft.com/office/word/2010/wordprocessingGroup" xmlns:wpi="http://schemas.microsoft.com/office/word/2010/wordprocessingInk" xmlns:wne="http://schemas.microsoft.com/office/word/2006/wordml" xmlns:wps="http://schemas.microsoft.com/office/word/2010/wordprocessingShape" mc:Ignorable="w14 w15 w16se w16cid w16 w16cex w16sdtdh w16sdtfl w16du wp14">
-  <w:comment w:id="0" w:author="Boštjan Skubic (R4A)" w:date="2025-04-14T20:01:00Z" w:initials="BS">
+  <w:comment w:id="12" w:author="Boštjan Skubic (R4A)" w:date="2025-04-14T20:01:00Z" w:initials="BS">
     <w:p>
       <w:pPr>
         <w:pStyle w:val="Pripombabesedilo"/>
@@ -2490,7 +4600,7 @@
       </w:r>
     </w:p>
   </w:comment>
-  <w:comment w:id="1" w:author="Boštjan Skubic (R4A)" w:date="2025-04-14T20:01:00Z" w:initials="BS">
+  <w:comment w:id="18" w:author="Boštjan Skubic (R4A)" w:date="2025-04-14T20:01:00Z" w:initials="BS">
     <w:p>
       <w:pPr>
         <w:pStyle w:val="Pripombabesedilo"/>
@@ -4051,7 +6161,7 @@
         <w:kern w:val="2"/>
         <w:sz w:val="24"/>
         <w:szCs w:val="24"/>
-        <w:lang w:eastAsia="en-US" w:bidi="ar-SA"/>
+        <w:lang w:val="sl-SI" w:eastAsia="en-US" w:bidi="ar-SA"/>
         <w14:ligatures w14:val="standardContextual"/>
       </w:rPr>
     </w:rPrDefault>
@@ -4442,13 +6552,12 @@
   <w:style w:type="paragraph" w:default="1" w:styleId="Navaden">
     <w:name w:val="Normal"/>
     <w:qFormat/>
-    <w:rsid w:val="0028519E"/>
+    <w:rsid w:val="00F3648D"/>
     <w:pPr>
       <w:jc w:val="both"/>
     </w:pPr>
     <w:rPr>
       <w:rFonts w:ascii="Arial" w:hAnsi="Arial" w:cs="Arial"/>
-      <w:lang w:val="sl-SI"/>
     </w:rPr>
   </w:style>
   <w:style w:type="paragraph" w:styleId="Naslov1">
@@ -5086,6 +7195,76 @@
       <w:bCs/>
     </w:rPr>
   </w:style>
+  <w:style w:type="paragraph" w:styleId="NaslovTOC">
+    <w:name w:val="TOC Heading"/>
+    <w:basedOn w:val="Naslov1"/>
+    <w:next w:val="Navaden"/>
+    <w:uiPriority w:val="39"/>
+    <w:unhideWhenUsed/>
+    <w:qFormat/>
+    <w:rsid w:val="00880E88"/>
+    <w:pPr>
+      <w:spacing w:before="240" w:after="0" w:line="259" w:lineRule="auto"/>
+      <w:jc w:val="left"/>
+      <w:outlineLvl w:val="9"/>
+    </w:pPr>
+    <w:rPr>
+      <w:kern w:val="0"/>
+      <w:sz w:val="32"/>
+      <w:szCs w:val="32"/>
+      <w:lang w:eastAsia="sl-SI"/>
+      <w14:ligatures w14:val="none"/>
+    </w:rPr>
+  </w:style>
+  <w:style w:type="paragraph" w:styleId="Kazalovsebine1">
+    <w:name w:val="toc 1"/>
+    <w:basedOn w:val="Navaden"/>
+    <w:next w:val="Navaden"/>
+    <w:autoRedefine/>
+    <w:uiPriority w:val="39"/>
+    <w:unhideWhenUsed/>
+    <w:rsid w:val="00880E88"/>
+    <w:pPr>
+      <w:spacing w:after="100"/>
+    </w:pPr>
+  </w:style>
+  <w:style w:type="paragraph" w:styleId="Kazalovsebine2">
+    <w:name w:val="toc 2"/>
+    <w:basedOn w:val="Navaden"/>
+    <w:next w:val="Navaden"/>
+    <w:autoRedefine/>
+    <w:uiPriority w:val="39"/>
+    <w:unhideWhenUsed/>
+    <w:rsid w:val="00880E88"/>
+    <w:pPr>
+      <w:spacing w:after="100"/>
+      <w:ind w:left="240"/>
+    </w:pPr>
+  </w:style>
+  <w:style w:type="paragraph" w:styleId="Kazalovsebine3">
+    <w:name w:val="toc 3"/>
+    <w:basedOn w:val="Navaden"/>
+    <w:next w:val="Navaden"/>
+    <w:autoRedefine/>
+    <w:uiPriority w:val="39"/>
+    <w:unhideWhenUsed/>
+    <w:rsid w:val="00880E88"/>
+    <w:pPr>
+      <w:spacing w:after="100"/>
+      <w:ind w:left="480"/>
+    </w:pPr>
+  </w:style>
+  <w:style w:type="character" w:styleId="Hiperpovezava">
+    <w:name w:val="Hyperlink"/>
+    <w:basedOn w:val="Privzetapisavaodstavka"/>
+    <w:uiPriority w:val="99"/>
+    <w:unhideWhenUsed/>
+    <w:rsid w:val="00880E88"/>
+    <w:rPr>
+      <w:color w:val="467886" w:themeColor="hyperlink"/>
+      <w:u w:val="single"/>
+    </w:rPr>
+  </w:style>
 </w:styles>
 </file>
 

</xml_diff>